<commit_message>
updated styling of validate address pseudocode
</commit_message>
<xml_diff>
--- a/03_Team_Work/Team5/Milestone_5_Algorithms/IC_Done/M5_WT_1.12.1-ALG_getValidatedAddress.docx
+++ b/03_Team_Work/Team5/Milestone_5_Algorithms/IC_Done/M5_WT_1.12.1-ALG_getValidatedAddress.docx
@@ -36,629 +36,65 @@
       </w:r>
     </w:p>
     <w:p>
-      <w:pPr>
-        <w:pBdr>
-          <w:bottom w:val="single" w:sz="6" w:space="1" w:color="auto"/>
-        </w:pBdr>
-      </w:pPr>
       <w:r>
         <w:t>Retrieves a USPS-validated address by validating the city and ZIP code and returning a standardized address when the input is valid.</w:t>
       </w:r>
     </w:p>
     <w:p>
-      <w:pPr>
-        <w:spacing w:line="240" w:lineRule="auto"/>
-        <w:rPr>
-          <w:rFonts w:ascii="Cascadia Mono" w:hAnsi="Cascadia Mono" w:cs="Cascadia Mono"/>
-        </w:rPr>
-      </w:pPr>
-    </w:p>
-    <w:p>
-      <w:pPr>
-        <w:spacing w:line="240" w:lineRule="auto"/>
-        <w:rPr>
-          <w:rFonts w:ascii="Cascadia Mono" w:hAnsi="Cascadia Mono" w:cs="Cascadia Mono"/>
-          <w:sz w:val="20"/>
-          <w:szCs w:val="20"/>
-        </w:rPr>
-      </w:pPr>
       <w:r>
         <w:rPr>
-          <w:rFonts w:ascii="Cascadia Mono" w:hAnsi="Cascadia Mono" w:cs="Cascadia Mono"/>
-          <w:sz w:val="20"/>
-          <w:szCs w:val="20"/>
+          <w:noProof/>
         </w:rPr>
-        <w:t xml:space="preserve">FUNCTION </w:t>
-      </w:r>
-      <w:proofErr w:type="spellStart"/>
-      <w:r>
-        <w:rPr>
-          <w:rFonts w:ascii="Cascadia Mono" w:hAnsi="Cascadia Mono" w:cs="Cascadia Mono"/>
-          <w:sz w:val="20"/>
-          <w:szCs w:val="20"/>
-        </w:rPr>
-        <w:t>getValidatedAddress</w:t>
-      </w:r>
-      <w:proofErr w:type="spellEnd"/>
-      <w:r>
-        <w:rPr>
-          <w:rFonts w:ascii="Cascadia Mono" w:hAnsi="Cascadia Mono" w:cs="Cascadia Mono"/>
-          <w:sz w:val="20"/>
-          <w:szCs w:val="20"/>
-        </w:rPr>
-        <w:t>(</w:t>
-      </w:r>
-      <w:proofErr w:type="spellStart"/>
-      <w:r>
-        <w:rPr>
-          <w:rFonts w:ascii="Cascadia Mono" w:hAnsi="Cascadia Mono" w:cs="Cascadia Mono"/>
-          <w:sz w:val="20"/>
-          <w:szCs w:val="20"/>
-        </w:rPr>
-        <w:t>addressRequest</w:t>
-      </w:r>
-      <w:proofErr w:type="spellEnd"/>
-      <w:r>
-        <w:rPr>
-          <w:rFonts w:ascii="Cascadia Mono" w:hAnsi="Cascadia Mono" w:cs="Cascadia Mono"/>
-          <w:sz w:val="20"/>
-          <w:szCs w:val="20"/>
-        </w:rPr>
-        <w:t xml:space="preserve">) </w:t>
+        <w:drawing>
+          <wp:inline distT="0" distB="0" distL="0" distR="0" wp14:anchorId="6D9A99A0" wp14:editId="2538DBFE">
+            <wp:extent cx="5943600" cy="6292850"/>
+            <wp:effectExtent l="0" t="0" r="0" b="0"/>
+            <wp:docPr id="1428131505" name="Picture 1"/>
+            <wp:cNvGraphicFramePr>
+              <a:graphicFrameLocks xmlns:a="http://schemas.openxmlformats.org/drawingml/2006/main" noChangeAspect="1"/>
+            </wp:cNvGraphicFramePr>
+            <a:graphic xmlns:a="http://schemas.openxmlformats.org/drawingml/2006/main">
+              <a:graphicData uri="http://schemas.openxmlformats.org/drawingml/2006/picture">
+                <pic:pic xmlns:pic="http://schemas.openxmlformats.org/drawingml/2006/picture">
+                  <pic:nvPicPr>
+                    <pic:cNvPr id="0" name="Picture 5"/>
+                    <pic:cNvPicPr>
+                      <a:picLocks noChangeAspect="1" noChangeArrowheads="1"/>
+                    </pic:cNvPicPr>
+                  </pic:nvPicPr>
+                  <pic:blipFill>
+                    <a:blip r:embed="rId4">
+                      <a:extLst>
+                        <a:ext uri="{28A0092B-C50C-407E-A947-70E740481C1C}">
+                          <a14:useLocalDpi xmlns:a14="http://schemas.microsoft.com/office/drawing/2010/main" val="0"/>
+                        </a:ext>
+                      </a:extLst>
+                    </a:blip>
+                    <a:srcRect/>
+                    <a:stretch>
+                      <a:fillRect/>
+                    </a:stretch>
+                  </pic:blipFill>
+                  <pic:spPr bwMode="auto">
+                    <a:xfrm>
+                      <a:off x="0" y="0"/>
+                      <a:ext cx="5943600" cy="6292850"/>
+                    </a:xfrm>
+                    <a:prstGeom prst="rect">
+                      <a:avLst/>
+                    </a:prstGeom>
+                    <a:noFill/>
+                    <a:ln>
+                      <a:noFill/>
+                    </a:ln>
+                  </pic:spPr>
+                </pic:pic>
+              </a:graphicData>
+            </a:graphic>
+          </wp:inline>
+        </w:drawing>
       </w:r>
     </w:p>
-    <w:p>
-      <w:pPr>
-        <w:spacing w:line="240" w:lineRule="auto"/>
-        <w:ind w:firstLine="720"/>
-        <w:rPr>
-          <w:rFonts w:ascii="Cascadia Mono" w:hAnsi="Cascadia Mono" w:cs="Cascadia Mono"/>
-          <w:sz w:val="20"/>
-          <w:szCs w:val="20"/>
-        </w:rPr>
-      </w:pPr>
-      <w:r>
-        <w:rPr>
-          <w:rFonts w:ascii="Cascadia Mono" w:hAnsi="Cascadia Mono" w:cs="Cascadia Mono"/>
-          <w:sz w:val="20"/>
-          <w:szCs w:val="20"/>
-        </w:rPr>
-        <w:t xml:space="preserve">GET </w:t>
-      </w:r>
-      <w:proofErr w:type="spellStart"/>
-      <w:r>
-        <w:rPr>
-          <w:rFonts w:ascii="Cascadia Mono" w:hAnsi="Cascadia Mono" w:cs="Cascadia Mono"/>
-          <w:sz w:val="20"/>
-          <w:szCs w:val="20"/>
-        </w:rPr>
-        <w:t>streetAddress</w:t>
-      </w:r>
-      <w:proofErr w:type="spellEnd"/>
-      <w:r>
-        <w:rPr>
-          <w:rFonts w:ascii="Cascadia Mono" w:hAnsi="Cascadia Mono" w:cs="Cascadia Mono"/>
-          <w:sz w:val="20"/>
-          <w:szCs w:val="20"/>
-        </w:rPr>
-        <w:t xml:space="preserve"> </w:t>
-      </w:r>
-    </w:p>
-    <w:p>
-      <w:pPr>
-        <w:spacing w:line="240" w:lineRule="auto"/>
-        <w:ind w:left="720"/>
-        <w:rPr>
-          <w:rFonts w:ascii="Cascadia Mono" w:hAnsi="Cascadia Mono" w:cs="Cascadia Mono"/>
-          <w:sz w:val="20"/>
-          <w:szCs w:val="20"/>
-        </w:rPr>
-      </w:pPr>
-      <w:r>
-        <w:rPr>
-          <w:rFonts w:ascii="Cascadia Mono" w:hAnsi="Cascadia Mono" w:cs="Cascadia Mono"/>
-          <w:sz w:val="20"/>
-          <w:szCs w:val="20"/>
-        </w:rPr>
-        <w:t xml:space="preserve">GET </w:t>
-      </w:r>
-      <w:proofErr w:type="spellStart"/>
-      <w:r>
-        <w:rPr>
-          <w:rFonts w:ascii="Cascadia Mono" w:hAnsi="Cascadia Mono" w:cs="Cascadia Mono"/>
-          <w:sz w:val="20"/>
-          <w:szCs w:val="20"/>
-        </w:rPr>
-        <w:t>suiteNumber</w:t>
-      </w:r>
-      <w:proofErr w:type="spellEnd"/>
-      <w:r>
-        <w:rPr>
-          <w:rFonts w:ascii="Cascadia Mono" w:hAnsi="Cascadia Mono" w:cs="Cascadia Mono"/>
-          <w:sz w:val="20"/>
-          <w:szCs w:val="20"/>
-        </w:rPr>
-        <w:t xml:space="preserve"> </w:t>
-      </w:r>
-    </w:p>
-    <w:p>
-      <w:pPr>
-        <w:spacing w:line="240" w:lineRule="auto"/>
-        <w:ind w:left="720"/>
-        <w:rPr>
-          <w:rFonts w:ascii="Cascadia Mono" w:hAnsi="Cascadia Mono" w:cs="Cascadia Mono"/>
-          <w:sz w:val="20"/>
-          <w:szCs w:val="20"/>
-        </w:rPr>
-      </w:pPr>
-      <w:r>
-        <w:rPr>
-          <w:rFonts w:ascii="Cascadia Mono" w:hAnsi="Cascadia Mono" w:cs="Cascadia Mono"/>
-          <w:sz w:val="20"/>
-          <w:szCs w:val="20"/>
-        </w:rPr>
-        <w:t xml:space="preserve">GET city GET state </w:t>
-      </w:r>
-    </w:p>
-    <w:p>
-      <w:pPr>
-        <w:spacing w:line="240" w:lineRule="auto"/>
-        <w:ind w:left="720"/>
-        <w:rPr>
-          <w:rFonts w:ascii="Cascadia Mono" w:hAnsi="Cascadia Mono" w:cs="Cascadia Mono"/>
-          <w:sz w:val="20"/>
-          <w:szCs w:val="20"/>
-        </w:rPr>
-      </w:pPr>
-      <w:r>
-        <w:rPr>
-          <w:rFonts w:ascii="Cascadia Mono" w:hAnsi="Cascadia Mono" w:cs="Cascadia Mono"/>
-          <w:sz w:val="20"/>
-          <w:szCs w:val="20"/>
-        </w:rPr>
-        <w:t xml:space="preserve">GET </w:t>
-      </w:r>
-      <w:proofErr w:type="spellStart"/>
-      <w:r>
-        <w:rPr>
-          <w:rFonts w:ascii="Cascadia Mono" w:hAnsi="Cascadia Mono" w:cs="Cascadia Mono"/>
-          <w:sz w:val="20"/>
-          <w:szCs w:val="20"/>
-        </w:rPr>
-        <w:t>zipCode</w:t>
-      </w:r>
-      <w:proofErr w:type="spellEnd"/>
-      <w:r>
-        <w:rPr>
-          <w:rFonts w:ascii="Cascadia Mono" w:hAnsi="Cascadia Mono" w:cs="Cascadia Mono"/>
-          <w:sz w:val="20"/>
-          <w:szCs w:val="20"/>
-        </w:rPr>
-        <w:t xml:space="preserve"> </w:t>
-      </w:r>
-    </w:p>
-    <w:p>
-      <w:pPr>
-        <w:spacing w:line="240" w:lineRule="auto"/>
-        <w:ind w:left="720"/>
-        <w:rPr>
-          <w:rFonts w:ascii="Cascadia Mono" w:hAnsi="Cascadia Mono" w:cs="Cascadia Mono"/>
-          <w:sz w:val="20"/>
-          <w:szCs w:val="20"/>
-        </w:rPr>
-      </w:pPr>
-      <w:r>
-        <w:rPr>
-          <w:rFonts w:ascii="Cascadia Mono" w:hAnsi="Cascadia Mono" w:cs="Cascadia Mono"/>
-          <w:sz w:val="20"/>
-          <w:szCs w:val="20"/>
-        </w:rPr>
-        <w:t xml:space="preserve">GET country </w:t>
-      </w:r>
-    </w:p>
-    <w:p>
-      <w:pPr>
-        <w:spacing w:line="240" w:lineRule="auto"/>
-        <w:ind w:left="720"/>
-        <w:rPr>
-          <w:rFonts w:ascii="Cascadia Mono" w:hAnsi="Cascadia Mono" w:cs="Cascadia Mono"/>
-          <w:sz w:val="20"/>
-          <w:szCs w:val="20"/>
-        </w:rPr>
-      </w:pPr>
-    </w:p>
-    <w:p>
-      <w:pPr>
-        <w:spacing w:line="240" w:lineRule="auto"/>
-        <w:ind w:left="720"/>
-        <w:rPr>
-          <w:rFonts w:ascii="Cascadia Mono" w:hAnsi="Cascadia Mono" w:cs="Cascadia Mono"/>
-          <w:sz w:val="20"/>
-          <w:szCs w:val="20"/>
-        </w:rPr>
-      </w:pPr>
-      <w:r>
-        <w:rPr>
-          <w:rFonts w:ascii="Cascadia Mono" w:hAnsi="Cascadia Mono" w:cs="Cascadia Mono"/>
-          <w:sz w:val="20"/>
-          <w:szCs w:val="20"/>
-        </w:rPr>
-        <w:t xml:space="preserve">IF </w:t>
-      </w:r>
-      <w:proofErr w:type="spellStart"/>
-      <w:proofErr w:type="gramStart"/>
-      <w:r>
-        <w:rPr>
-          <w:rFonts w:ascii="Cascadia Mono" w:hAnsi="Cascadia Mono" w:cs="Cascadia Mono"/>
-          <w:sz w:val="20"/>
-          <w:szCs w:val="20"/>
-        </w:rPr>
-        <w:t>validateCity</w:t>
-      </w:r>
-      <w:proofErr w:type="spellEnd"/>
-      <w:r>
-        <w:rPr>
-          <w:rFonts w:ascii="Cascadia Mono" w:hAnsi="Cascadia Mono" w:cs="Cascadia Mono"/>
-          <w:sz w:val="20"/>
-          <w:szCs w:val="20"/>
-        </w:rPr>
-        <w:t>(</w:t>
-      </w:r>
-      <w:proofErr w:type="gramEnd"/>
-      <w:r>
-        <w:rPr>
-          <w:rFonts w:ascii="Cascadia Mono" w:hAnsi="Cascadia Mono" w:cs="Cascadia Mono"/>
-          <w:sz w:val="20"/>
-          <w:szCs w:val="20"/>
-        </w:rPr>
-        <w:t xml:space="preserve">city, state) = FALSE THEN </w:t>
-      </w:r>
-    </w:p>
-    <w:p>
-      <w:pPr>
-        <w:spacing w:line="240" w:lineRule="auto"/>
-        <w:ind w:left="720" w:firstLine="720"/>
-        <w:rPr>
-          <w:rFonts w:ascii="Cascadia Mono" w:hAnsi="Cascadia Mono" w:cs="Cascadia Mono"/>
-          <w:sz w:val="20"/>
-          <w:szCs w:val="20"/>
-        </w:rPr>
-      </w:pPr>
-      <w:r>
-        <w:rPr>
-          <w:rFonts w:ascii="Cascadia Mono" w:hAnsi="Cascadia Mono" w:cs="Cascadia Mono"/>
-          <w:sz w:val="20"/>
-          <w:szCs w:val="20"/>
-        </w:rPr>
-        <w:t>WRITE "Invalid City"</w:t>
-      </w:r>
-    </w:p>
-    <w:p>
-      <w:pPr>
-        <w:spacing w:line="240" w:lineRule="auto"/>
-        <w:ind w:left="720" w:firstLine="720"/>
-        <w:rPr>
-          <w:rFonts w:ascii="Cascadia Mono" w:hAnsi="Cascadia Mono" w:cs="Cascadia Mono"/>
-          <w:sz w:val="20"/>
-          <w:szCs w:val="20"/>
-        </w:rPr>
-      </w:pPr>
-      <w:r>
-        <w:rPr>
-          <w:rFonts w:ascii="Cascadia Mono" w:hAnsi="Cascadia Mono" w:cs="Cascadia Mono"/>
-          <w:sz w:val="20"/>
-          <w:szCs w:val="20"/>
-        </w:rPr>
-        <w:t xml:space="preserve">RETURN NULL </w:t>
-      </w:r>
-    </w:p>
-    <w:p>
-      <w:pPr>
-        <w:spacing w:line="240" w:lineRule="auto"/>
-        <w:ind w:left="720"/>
-        <w:rPr>
-          <w:rFonts w:ascii="Cascadia Mono" w:hAnsi="Cascadia Mono" w:cs="Cascadia Mono"/>
-          <w:sz w:val="20"/>
-          <w:szCs w:val="20"/>
-        </w:rPr>
-      </w:pPr>
-      <w:r>
-        <w:rPr>
-          <w:rFonts w:ascii="Cascadia Mono" w:hAnsi="Cascadia Mono" w:cs="Cascadia Mono"/>
-          <w:sz w:val="20"/>
-          <w:szCs w:val="20"/>
-        </w:rPr>
-        <w:t xml:space="preserve">ENDIF </w:t>
-      </w:r>
-    </w:p>
-    <w:p>
-      <w:pPr>
-        <w:spacing w:line="240" w:lineRule="auto"/>
-        <w:ind w:left="720"/>
-        <w:rPr>
-          <w:rFonts w:ascii="Cascadia Mono" w:hAnsi="Cascadia Mono" w:cs="Cascadia Mono"/>
-          <w:sz w:val="20"/>
-          <w:szCs w:val="20"/>
-        </w:rPr>
-      </w:pPr>
-    </w:p>
-    <w:p>
-      <w:pPr>
-        <w:spacing w:line="240" w:lineRule="auto"/>
-        <w:ind w:left="720"/>
-        <w:rPr>
-          <w:rFonts w:ascii="Cascadia Mono" w:hAnsi="Cascadia Mono" w:cs="Cascadia Mono"/>
-          <w:sz w:val="20"/>
-          <w:szCs w:val="20"/>
-        </w:rPr>
-      </w:pPr>
-      <w:r>
-        <w:rPr>
-          <w:rFonts w:ascii="Cascadia Mono" w:hAnsi="Cascadia Mono" w:cs="Cascadia Mono"/>
-          <w:sz w:val="20"/>
-          <w:szCs w:val="20"/>
-        </w:rPr>
-        <w:t xml:space="preserve">IF </w:t>
-      </w:r>
-      <w:proofErr w:type="spellStart"/>
-      <w:proofErr w:type="gramStart"/>
-      <w:r>
-        <w:rPr>
-          <w:rFonts w:ascii="Cascadia Mono" w:hAnsi="Cascadia Mono" w:cs="Cascadia Mono"/>
-          <w:sz w:val="20"/>
-          <w:szCs w:val="20"/>
-        </w:rPr>
-        <w:t>validateZip</w:t>
-      </w:r>
-      <w:proofErr w:type="spellEnd"/>
-      <w:r>
-        <w:rPr>
-          <w:rFonts w:ascii="Cascadia Mono" w:hAnsi="Cascadia Mono" w:cs="Cascadia Mono"/>
-          <w:sz w:val="20"/>
-          <w:szCs w:val="20"/>
-        </w:rPr>
-        <w:t>(</w:t>
-      </w:r>
-      <w:proofErr w:type="gramEnd"/>
-      <w:r>
-        <w:rPr>
-          <w:rFonts w:ascii="Cascadia Mono" w:hAnsi="Cascadia Mono" w:cs="Cascadia Mono"/>
-          <w:sz w:val="20"/>
-          <w:szCs w:val="20"/>
-        </w:rPr>
-        <w:t xml:space="preserve">city, state, </w:t>
-      </w:r>
-      <w:proofErr w:type="spellStart"/>
-      <w:r>
-        <w:rPr>
-          <w:rFonts w:ascii="Cascadia Mono" w:hAnsi="Cascadia Mono" w:cs="Cascadia Mono"/>
-          <w:sz w:val="20"/>
-          <w:szCs w:val="20"/>
-        </w:rPr>
-        <w:t>zipCode</w:t>
-      </w:r>
-      <w:proofErr w:type="spellEnd"/>
-      <w:r>
-        <w:rPr>
-          <w:rFonts w:ascii="Cascadia Mono" w:hAnsi="Cascadia Mono" w:cs="Cascadia Mono"/>
-          <w:sz w:val="20"/>
-          <w:szCs w:val="20"/>
-        </w:rPr>
-        <w:t xml:space="preserve">) = FALSE THEN </w:t>
-      </w:r>
-    </w:p>
-    <w:p>
-      <w:pPr>
-        <w:spacing w:line="240" w:lineRule="auto"/>
-        <w:ind w:left="720" w:firstLine="720"/>
-        <w:rPr>
-          <w:rFonts w:ascii="Cascadia Mono" w:hAnsi="Cascadia Mono" w:cs="Cascadia Mono"/>
-          <w:sz w:val="20"/>
-          <w:szCs w:val="20"/>
-        </w:rPr>
-      </w:pPr>
-      <w:r>
-        <w:rPr>
-          <w:rFonts w:ascii="Cascadia Mono" w:hAnsi="Cascadia Mono" w:cs="Cascadia Mono"/>
-          <w:sz w:val="20"/>
-          <w:szCs w:val="20"/>
-        </w:rPr>
-        <w:t xml:space="preserve">WRITE "Invalid ZIP Code" </w:t>
-      </w:r>
-    </w:p>
-    <w:p>
-      <w:pPr>
-        <w:spacing w:line="240" w:lineRule="auto"/>
-        <w:ind w:left="720" w:firstLine="720"/>
-        <w:rPr>
-          <w:rFonts w:ascii="Cascadia Mono" w:hAnsi="Cascadia Mono" w:cs="Cascadia Mono"/>
-          <w:sz w:val="20"/>
-          <w:szCs w:val="20"/>
-        </w:rPr>
-      </w:pPr>
-      <w:r>
-        <w:rPr>
-          <w:rFonts w:ascii="Cascadia Mono" w:hAnsi="Cascadia Mono" w:cs="Cascadia Mono"/>
-          <w:sz w:val="20"/>
-          <w:szCs w:val="20"/>
-        </w:rPr>
-        <w:t xml:space="preserve">RETURN NULL </w:t>
-      </w:r>
-    </w:p>
-    <w:p>
-      <w:pPr>
-        <w:spacing w:line="240" w:lineRule="auto"/>
-        <w:ind w:left="720"/>
-        <w:rPr>
-          <w:rFonts w:ascii="Cascadia Mono" w:hAnsi="Cascadia Mono" w:cs="Cascadia Mono"/>
-          <w:sz w:val="20"/>
-          <w:szCs w:val="20"/>
-        </w:rPr>
-      </w:pPr>
-      <w:r>
-        <w:rPr>
-          <w:rFonts w:ascii="Cascadia Mono" w:hAnsi="Cascadia Mono" w:cs="Cascadia Mono"/>
-          <w:sz w:val="20"/>
-          <w:szCs w:val="20"/>
-        </w:rPr>
-        <w:t xml:space="preserve">ENDIF </w:t>
-      </w:r>
-    </w:p>
-    <w:p>
-      <w:pPr>
-        <w:spacing w:line="240" w:lineRule="auto"/>
-        <w:ind w:left="720"/>
-        <w:rPr>
-          <w:rFonts w:ascii="Cascadia Mono" w:hAnsi="Cascadia Mono" w:cs="Cascadia Mono"/>
-          <w:sz w:val="20"/>
-          <w:szCs w:val="20"/>
-        </w:rPr>
-      </w:pPr>
-    </w:p>
-    <w:p>
-      <w:pPr>
-        <w:spacing w:line="240" w:lineRule="auto"/>
-        <w:ind w:left="720"/>
-        <w:rPr>
-          <w:rFonts w:ascii="Cascadia Mono" w:hAnsi="Cascadia Mono" w:cs="Cascadia Mono"/>
-          <w:sz w:val="20"/>
-          <w:szCs w:val="20"/>
-        </w:rPr>
-      </w:pPr>
-      <w:r>
-        <w:rPr>
-          <w:rFonts w:ascii="Cascadia Mono" w:hAnsi="Cascadia Mono" w:cs="Cascadia Mono"/>
-          <w:sz w:val="20"/>
-          <w:szCs w:val="20"/>
-        </w:rPr>
-        <w:t xml:space="preserve">PUT </w:t>
-      </w:r>
-      <w:proofErr w:type="spellStart"/>
-      <w:r>
-        <w:rPr>
-          <w:rFonts w:ascii="Cascadia Mono" w:hAnsi="Cascadia Mono" w:cs="Cascadia Mono"/>
-          <w:sz w:val="20"/>
-          <w:szCs w:val="20"/>
-        </w:rPr>
-        <w:t>addressRequest</w:t>
-      </w:r>
-      <w:proofErr w:type="spellEnd"/>
-      <w:r>
-        <w:rPr>
-          <w:rFonts w:ascii="Cascadia Mono" w:hAnsi="Cascadia Mono" w:cs="Cascadia Mono"/>
-          <w:sz w:val="20"/>
-          <w:szCs w:val="20"/>
-        </w:rPr>
-        <w:t xml:space="preserve"> INTO </w:t>
-      </w:r>
-      <w:proofErr w:type="spellStart"/>
-      <w:r>
-        <w:rPr>
-          <w:rFonts w:ascii="Cascadia Mono" w:hAnsi="Cascadia Mono" w:cs="Cascadia Mono"/>
-          <w:sz w:val="20"/>
-          <w:szCs w:val="20"/>
-        </w:rPr>
-        <w:t>ValidatedAddress</w:t>
-      </w:r>
-      <w:proofErr w:type="spellEnd"/>
-      <w:r>
-        <w:rPr>
-          <w:rFonts w:ascii="Cascadia Mono" w:hAnsi="Cascadia Mono" w:cs="Cascadia Mono"/>
-          <w:sz w:val="20"/>
-          <w:szCs w:val="20"/>
-        </w:rPr>
-        <w:t xml:space="preserve"> </w:t>
-      </w:r>
-    </w:p>
-    <w:p>
-      <w:pPr>
-        <w:spacing w:line="240" w:lineRule="auto"/>
-        <w:ind w:left="720"/>
-        <w:rPr>
-          <w:rFonts w:ascii="Cascadia Mono" w:hAnsi="Cascadia Mono" w:cs="Cascadia Mono"/>
-          <w:sz w:val="20"/>
-          <w:szCs w:val="20"/>
-        </w:rPr>
-      </w:pPr>
-    </w:p>
-    <w:p>
-      <w:pPr>
-        <w:spacing w:line="240" w:lineRule="auto"/>
-        <w:ind w:left="720"/>
-        <w:rPr>
-          <w:rFonts w:ascii="Cascadia Mono" w:hAnsi="Cascadia Mono" w:cs="Cascadia Mono"/>
-          <w:sz w:val="20"/>
-          <w:szCs w:val="20"/>
-        </w:rPr>
-      </w:pPr>
-      <w:r>
-        <w:rPr>
-          <w:rFonts w:ascii="Cascadia Mono" w:hAnsi="Cascadia Mono" w:cs="Cascadia Mono"/>
-          <w:sz w:val="20"/>
-          <w:szCs w:val="20"/>
-        </w:rPr>
-        <w:t xml:space="preserve">RETURN </w:t>
-      </w:r>
-      <w:proofErr w:type="spellStart"/>
-      <w:r>
-        <w:rPr>
-          <w:rFonts w:ascii="Cascadia Mono" w:hAnsi="Cascadia Mono" w:cs="Cascadia Mono"/>
-          <w:sz w:val="20"/>
-          <w:szCs w:val="20"/>
-        </w:rPr>
-        <w:t>ValidatedAddress</w:t>
-      </w:r>
-      <w:proofErr w:type="spellEnd"/>
-      <w:r>
-        <w:rPr>
-          <w:rFonts w:ascii="Cascadia Mono" w:hAnsi="Cascadia Mono" w:cs="Cascadia Mono"/>
-          <w:sz w:val="20"/>
-          <w:szCs w:val="20"/>
-        </w:rPr>
-        <w:t xml:space="preserve"> </w:t>
-      </w:r>
-    </w:p>
-    <w:p>
-      <w:pPr>
-        <w:pBdr>
-          <w:bottom w:val="single" w:sz="6" w:space="1" w:color="auto"/>
-        </w:pBdr>
-        <w:spacing w:line="240" w:lineRule="auto"/>
-        <w:rPr>
-          <w:rFonts w:ascii="Cascadia Mono" w:hAnsi="Cascadia Mono" w:cs="Cascadia Mono"/>
-          <w:sz w:val="20"/>
-          <w:szCs w:val="20"/>
-        </w:rPr>
-      </w:pPr>
-      <w:r>
-        <w:rPr>
-          <w:rFonts w:ascii="Cascadia Mono" w:hAnsi="Cascadia Mono" w:cs="Cascadia Mono"/>
-          <w:sz w:val="20"/>
-          <w:szCs w:val="20"/>
-        </w:rPr>
-        <w:t>END FUNCTION</w:t>
-      </w:r>
-    </w:p>
-    <w:p>
-      <w:pPr>
-        <w:pBdr>
-          <w:bottom w:val="single" w:sz="6" w:space="1" w:color="auto"/>
-        </w:pBdr>
-        <w:spacing w:line="240" w:lineRule="auto"/>
-        <w:rPr>
-          <w:rFonts w:ascii="Cascadia Mono" w:hAnsi="Cascadia Mono" w:cs="Cascadia Mono"/>
-        </w:rPr>
-      </w:pPr>
-    </w:p>
-    <w:p>
-      <w:pPr>
-        <w:spacing w:line="240" w:lineRule="auto"/>
-        <w:rPr>
-          <w:rFonts w:ascii="Cascadia Mono" w:hAnsi="Cascadia Mono" w:cs="Cascadia Mono"/>
-        </w:rPr>
-      </w:pPr>
-    </w:p>
-    <w:p/>
     <w:p/>
     <w:p>
       <w:pPr>
@@ -1283,6 +719,7 @@
   <w:style w:type="character" w:default="1" w:styleId="DefaultParagraphFont">
     <w:name w:val="Default Paragraph Font"/>
     <w:uiPriority w:val="1"/>
+    <w:semiHidden/>
     <w:unhideWhenUsed/>
   </w:style>
   <w:style w:type="table" w:default="1" w:styleId="TableNormal">

</xml_diff>

<commit_message>
updated address validation algorithm's styles
</commit_message>
<xml_diff>
--- a/03_Team_Work/Team5/Milestone_5_Algorithms/IC_Done/M5_WT_1.12.1-ALG_getValidatedAddress.docx
+++ b/03_Team_Work/Team5/Milestone_5_Algorithms/IC_Done/M5_WT_1.12.1-ALG_getValidatedAddress.docx
@@ -2,24 +2,6 @@
 <file path=word/document.xml><?xml version="1.0" encoding="utf-8"?>
 <w:document xmlns:wpc="http://schemas.microsoft.com/office/word/2010/wordprocessingCanvas" xmlns:cx="http://schemas.microsoft.com/office/drawing/2014/chartex" xmlns:cx1="http://schemas.microsoft.com/office/drawing/2015/9/8/chartex" xmlns:cx2="http://schemas.microsoft.com/office/drawing/2015/10/21/chartex" xmlns:cx3="http://schemas.microsoft.com/office/drawing/2016/5/9/chartex" xmlns:cx4="http://schemas.microsoft.com/office/drawing/2016/5/10/chartex" xmlns:cx5="http://schemas.microsoft.com/office/drawing/2016/5/11/chartex" xmlns:cx6="http://schemas.microsoft.com/office/drawing/2016/5/12/chartex" xmlns:cx7="http://schemas.microsoft.com/office/drawing/2016/5/13/chartex" xmlns:cx8="http://schemas.microsoft.com/office/drawing/2016/5/14/chartex" xmlns:mc="http://schemas.openxmlformats.org/markup-compatibility/2006" xmlns:aink="http://schemas.microsoft.com/office/drawing/2016/ink" xmlns:am3d="http://schemas.microsoft.com/office/drawing/2017/model3d" xmlns:o="urn:schemas-microsoft-com:office:office" xmlns:oel="http://schemas.microsoft.com/office/2019/extlst" xmlns:r="http://schemas.openxmlformats.org/officeDocument/2006/relationships" xmlns:m="http://schemas.openxmlformats.org/officeDocument/2006/math" xmlns:v="urn:schemas-microsoft-com:vml" xmlns:wp14="http://schemas.microsoft.com/office/word/2010/wordprocessingDrawing" xmlns:wp="http://schemas.openxmlformats.org/drawingml/2006/wordprocessingDrawing" xmlns:w10="urn:schemas-microsoft-com:office:word" xmlns:w="http://schemas.openxmlformats.org/wordprocessingml/2006/main" xmlns:w14="http://schemas.microsoft.com/office/word/2010/wordml" xmlns:w15="http://schemas.microsoft.com/office/word/2012/wordml" xmlns:w16cex="http://schemas.microsoft.com/office/word/2018/wordml/cex" xmlns:w16cid="http://schemas.microsoft.com/office/word/2016/wordml/cid" xmlns:w16="http://schemas.microsoft.com/office/word/2018/wordml" xmlns:w16du="http://schemas.microsoft.com/office/word/2023/wordml/word16du" xmlns:w16sdtdh="http://schemas.microsoft.com/office/word/2020/wordml/sdtdatahash" xmlns:w16sdtfl="http://schemas.microsoft.com/office/word/2024/wordml/sdtformatlock" xmlns:w16se="http://schemas.microsoft.com/office/word/2015/wordml/symex" xmlns:wpg="http://schemas.microsoft.com/office/word/2010/wordprocessingGroup" xmlns:wpi="http://schemas.microsoft.com/office/word/2010/wordprocessingInk" xmlns:wne="http://schemas.microsoft.com/office/word/2006/wordml" xmlns:wps="http://schemas.microsoft.com/office/word/2010/wordprocessingShape" mc:Ignorable="w14 w15 w16se w16cid w16 w16cex w16sdtdh w16sdtfl w16du wp14">
   <w:body>
-    <w:p>
-      <w:r>
-        <w:t xml:space="preserve">1.12.1-ALG </w:t>
-      </w:r>
-      <w:proofErr w:type="spellStart"/>
-      <w:proofErr w:type="gramStart"/>
-      <w:r>
-        <w:t>getValidateAddress</w:t>
-      </w:r>
-      <w:proofErr w:type="spellEnd"/>
-      <w:r>
-        <w:t>(</w:t>
-      </w:r>
-      <w:proofErr w:type="gramEnd"/>
-      <w:r>
-        <w:t>) Algorithm</w:t>
-      </w:r>
-    </w:p>
     <w:p>
       <w:pPr>
         <w:rPr>
@@ -32,11 +14,67 @@
           <w:b/>
           <w:bCs/>
         </w:rPr>
+        <w:t xml:space="preserve">1.12.1-ALG </w:t>
+      </w:r>
+      <w:proofErr w:type="spellStart"/>
+      <w:proofErr w:type="gramStart"/>
+      <w:r>
+        <w:rPr>
+          <w:b/>
+          <w:bCs/>
+        </w:rPr>
+        <w:t>getValidateAddress</w:t>
+      </w:r>
+      <w:proofErr w:type="spellEnd"/>
+      <w:r>
+        <w:rPr>
+          <w:b/>
+          <w:bCs/>
+        </w:rPr>
+        <w:t>(</w:t>
+      </w:r>
+      <w:proofErr w:type="gramEnd"/>
+      <w:r>
+        <w:rPr>
+          <w:b/>
+          <w:bCs/>
+        </w:rPr>
+        <w:t>) Algorithm</w:t>
+      </w:r>
+    </w:p>
+    <w:p>
+      <w:pPr>
+        <w:rPr>
+          <w:b/>
+          <w:bCs/>
+          <w:sz w:val="22"/>
+          <w:szCs w:val="22"/>
+        </w:rPr>
+      </w:pPr>
+      <w:r>
+        <w:rPr>
+          <w:b/>
+          <w:bCs/>
+          <w:sz w:val="22"/>
+          <w:szCs w:val="22"/>
+        </w:rPr>
         <w:t>Purpose:</w:t>
       </w:r>
     </w:p>
     <w:p>
+      <w:pPr>
+        <w:rPr>
+          <w:rFonts w:ascii="Times New Roman" w:hAnsi="Times New Roman" w:cs="Times New Roman"/>
+          <w:sz w:val="22"/>
+          <w:szCs w:val="22"/>
+        </w:rPr>
+      </w:pPr>
       <w:r>
+        <w:rPr>
+          <w:rFonts w:ascii="Times New Roman" w:hAnsi="Times New Roman" w:cs="Times New Roman"/>
+          <w:sz w:val="22"/>
+          <w:szCs w:val="22"/>
+        </w:rPr>
         <w:t>Retrieves a USPS-validated address by validating the city and ZIP code and returning a standardized address when the input is valid.</w:t>
       </w:r>
     </w:p>

</xml_diff>